<commit_message>
Add Windows Terminal screenshot to laboratory report
</commit_message>
<xml_diff>
--- a/Laboratory-Work-N1-Report.docx
+++ b/Laboratory-Work-N1-Report.docx
@@ -30,12 +30,61 @@
     </w:p>
     <w:p>
       <w:r>
-        <w:t>A portable Node.js installation is stored in the project on drive D. The verified versions are Node.js v24.22.1 and npm 11.19.1. The command output below was recorded on Windows and displayed in a local verification page.</w:t>
+        <w:t>A portable Node.js installation is stored in the project on drive D. The verified versions are Node.js v24.22.1 and npm 11.19.1. The versions were checked in Windows Terminal using node -v and npm -v.</w:t>
+      </w:r>
+    </w:p>
+    <w:p>
+      <w:pPr>
+        <w:keepNext/>
+      </w:pPr>
+      <w:r>
+        <w:drawing>
+          <wp:inline xmlns:a="http://schemas.openxmlformats.org/drawingml/2006/main" xmlns:pic="http://schemas.openxmlformats.org/drawingml/2006/picture">
+            <wp:extent cx="6309360" cy="3536203"/>
+            <wp:docPr id="11" name="Picture 11" descr="Node.js v24.22.1, npm 11.19.1 and Express 4.22.3 shown in Windows Terminal."/>
+            <wp:cNvGraphicFramePr>
+              <a:graphicFrameLocks noChangeAspect="1"/>
+            </wp:cNvGraphicFramePr>
+            <a:graphic>
+              <a:graphicData uri="http://schemas.openxmlformats.org/drawingml/2006/picture">
+                <pic:pic>
+                  <pic:nvPicPr>
+                    <pic:cNvPr id="0" name="01-terminal.png"/>
+                    <pic:cNvPicPr/>
+                  </pic:nvPicPr>
+                  <pic:blipFill>
+                    <a:blip r:embed="rId19"/>
+                    <a:stretch>
+                      <a:fillRect/>
+                    </a:stretch>
+                  </pic:blipFill>
+                  <pic:spPr>
+                    <a:xfrm>
+                      <a:off x="0" y="0"/>
+                      <a:ext cx="6309360" cy="3536203"/>
+                    </a:xfrm>
+                    <a:prstGeom prst="rect"/>
+                  </pic:spPr>
+                </pic:pic>
+              </a:graphicData>
+            </a:graphic>
+          </wp:inline>
+        </w:drawing>
+      </w:r>
+    </w:p>
+    <w:p>
+      <w:pPr>
+        <w:pStyle w:val="Caption"/>
+        <w:keepNext w:val="0"/>
+      </w:pPr>
+      <w:r>
+        <w:t>Figure 1. Node.js and npm versions in Windows Terminal.</w:t>
       </w:r>
     </w:p>
     <w:p>
       <w:pPr>
         <w:pStyle w:val="Heading1"/>
+        <w:pageBreakBefore/>
       </w:pPr>
       <w:r>
         <w:t>Task 2 Create the application</w:t>
@@ -92,7 +141,7 @@
         <w:keepNext w:val="0"/>
       </w:pPr>
       <w:r>
-        <w:t>Figure 1. Recorded version checks, installed dependency, syntax checks and directory contents.</w:t>
+        <w:t>Figure 2. Recorded version checks, installed dependency, syntax checks and directory contents.</w:t>
       </w:r>
     </w:p>
     <w:p>
@@ -159,7 +208,7 @@
         <w:keepNext w:val="0"/>
       </w:pPr>
       <w:r>
-        <w:t>Figure 2. express/index.html open in the GitHub code editor with the project tree visible.</w:t>
+        <w:t>Figure 3. express/index.html open in the GitHub code editor with the project tree visible.</w:t>
       </w:r>
     </w:p>
     <w:p>
@@ -231,7 +280,7 @@
         <w:keepNext w:val="0"/>
       </w:pPr>
       <w:r>
-        <w:t>Figure 3. The HTML template before the custom stylesheet and JavaScript are applied.</w:t>
+        <w:t>Figure 4. The HTML template before the custom stylesheet and JavaScript are applied.</w:t>
       </w:r>
     </w:p>
     <w:p>
@@ -311,7 +360,7 @@
         <w:keepNext w:val="0"/>
       </w:pPr>
       <w:r>
-        <w:t>Figure 4. The styled page with the Earth overview, navigation and solar system facts.</w:t>
+        <w:t>Figure 5. The styled page with the Earth overview, navigation and solar system facts.</w:t>
       </w:r>
     </w:p>
     <w:p>
@@ -396,7 +445,7 @@
         <w:keepNext w:val="0"/>
       </w:pPr>
       <w:r>
-        <w:t>Figure 5. The Outer planets filter displays Jupiter, Saturn, Uranus and Neptune.</w:t>
+        <w:t>Figure 6. The Outer planets filter displays Jupiter, Saturn, Uranus and Neptune.</w:t>
       </w:r>
     </w:p>
     <w:p>
@@ -445,7 +494,7 @@
         <w:keepNext w:val="0"/>
       </w:pPr>
       <w:r>
-        <w:t>Figure 6. Selecting Saturn opens its field notes. Escape, the close button or a click outside closes the dialog.</w:t>
+        <w:t>Figure 7. Selecting Saturn opens its field notes. Escape, the close button or a click outside closes the dialog.</w:t>
       </w:r>
     </w:p>
     <w:p>
@@ -512,7 +561,7 @@
         <w:keepNext w:val="0"/>
       </w:pPr>
       <w:r>
-        <w:t>Figure 7. Live search narrows the catalogue to Mars.</w:t>
+        <w:t>Figure 8. Live search narrows the catalogue to Mars.</w:t>
       </w:r>
     </w:p>
     <w:p>
@@ -561,7 +610,7 @@
         <w:keepNext w:val="0"/>
       </w:pPr>
       <w:r>
-        <w:t>Figure 8. Paused orbital animation with the Resume orbits control visible.</w:t>
+        <w:t>Figure 9. Paused orbital animation with the Resume orbits control visible.</w:t>
       </w:r>
     </w:p>
     <w:p>
@@ -638,7 +687,7 @@
         <w:keepNext w:val="0"/>
       </w:pPr>
       <w:r>
-        <w:t>Figure 9. Mobile layout and expanded navigation.</w:t>
+        <w:t>Figure 10. Mobile layout and expanded navigation.</w:t>
       </w:r>
     </w:p>
     <w:p>
@@ -715,7 +764,7 @@
         <w:keepNext w:val="0"/>
       </w:pPr>
       <w:r>
-        <w:t>Figure 10. Public repository with the committed project files.</w:t>
+        <w:t>Figure 11. Public repository with the committed project files.</w:t>
       </w:r>
     </w:p>
     <w:p>

</xml_diff>